<commit_message>
Attempting to put Docx file in
</commit_message>
<xml_diff>
--- a/Week4/Stage_1_Tutorial_Student_Handout.docx
+++ b/Week4/Stage_1_Tutorial_Student_Handout.docx
@@ -1,6 +1,6 @@
 
 <file path=word/document.xml><?xml version="1.0" encoding="utf-8"?>
-<w:document xmlns:wpc="http://schemas.microsoft.com/office/word/2010/wordprocessingCanvas" xmlns:cx="http://schemas.microsoft.com/office/drawing/2014/chartex" xmlns:cx1="http://schemas.microsoft.com/office/drawing/2015/9/8/chartex" xmlns:cx2="http://schemas.microsoft.com/office/drawing/2015/10/21/chartex" xmlns:cx3="http://schemas.microsoft.com/office/drawing/2016/5/9/chartex" xmlns:cx4="http://schemas.microsoft.com/office/drawing/2016/5/10/chartex" xmlns:cx5="http://schemas.microsoft.com/office/drawing/2016/5/11/chartex" xmlns:cx6="http://schemas.microsoft.com/office/drawing/2016/5/12/chartex" xmlns:cx7="http://schemas.microsoft.com/office/drawing/2016/5/13/chartex" xmlns:cx8="http://schemas.microsoft.com/office/drawing/2016/5/14/chartex" xmlns:mc="http://schemas.openxmlformats.org/markup-compatibility/2006" xmlns:aink="http://schemas.microsoft.com/office/drawing/2016/ink" xmlns:am3d="http://schemas.microsoft.com/office/drawing/2017/model3d" xmlns:o="urn:schemas-microsoft-com:office:office" xmlns:oel="http://schemas.microsoft.com/office/2019/extlst" xmlns:r="http://schemas.openxmlformats.org/officeDocument/2006/relationships" xmlns:m="http://schemas.openxmlformats.org/officeDocument/2006/math" xmlns:v="urn:schemas-microsoft-com:vml" xmlns:wp14="http://schemas.microsoft.com/office/word/2010/wordprocessingDrawing" xmlns:wp="http://schemas.openxmlformats.org/drawingml/2006/wordprocessingDrawing" xmlns:w10="urn:schemas-microsoft-com:office:word" xmlns:w="http://schemas.openxmlformats.org/wordprocessingml/2006/main" xmlns:w14="http://schemas.microsoft.com/office/word/2010/wordml" xmlns:w15="http://schemas.microsoft.com/office/word/2012/wordml" xmlns:w16cei="http://schemas.microsoft.com/office/word/2026/wordml/cei" xmlns:w16cex="http://schemas.microsoft.com/office/word/2018/wordml/cex" xmlns:w16cid="http://schemas.microsoft.com/office/word/2016/wordml/cid" xmlns:w16="http://schemas.microsoft.com/office/word/2018/wordml" xmlns:w16du="http://schemas.microsoft.com/office/word/2023/wordml/word16du" xmlns:w16sdtdh="http://schemas.microsoft.com/office/word/2020/wordml/sdtdatahash" xmlns:w16sdtfl="http://schemas.microsoft.com/office/word/2024/wordml/sdtformatlock" xmlns:w16se="http://schemas.microsoft.com/office/word/2015/wordml/symex" xmlns:wpg="http://schemas.microsoft.com/office/word/2010/wordprocessingGroup" xmlns:wpi="http://schemas.microsoft.com/office/word/2010/wordprocessingInk" xmlns:wne="http://schemas.microsoft.com/office/word/2006/wordml" xmlns:wps="http://schemas.microsoft.com/office/word/2010/wordprocessingShape" mc:Ignorable="w14 w15 w16se w16cid w16 w16cex w16sdtdh w16sdtfl w16du wp14">
+<w:document xmlns:wpc="http://schemas.microsoft.com/office/word/2010/wordprocessingCanvas" xmlns:cx="http://schemas.microsoft.com/office/drawing/2014/chartex" xmlns:cx1="http://schemas.microsoft.com/office/drawing/2015/9/8/chartex" xmlns:cx2="http://schemas.microsoft.com/office/drawing/2015/10/21/chartex" xmlns:cx3="http://schemas.microsoft.com/office/drawing/2016/5/9/chartex" xmlns:cx4="http://schemas.microsoft.com/office/drawing/2016/5/10/chartex" xmlns:cx5="http://schemas.microsoft.com/office/drawing/2016/5/11/chartex" xmlns:cx6="http://schemas.microsoft.com/office/drawing/2016/5/12/chartex" xmlns:cx7="http://schemas.microsoft.com/office/drawing/2016/5/13/chartex" xmlns:cx8="http://schemas.microsoft.com/office/drawing/2016/5/14/chartex" xmlns:mc="http://schemas.openxmlformats.org/markup-compatibility/2006" xmlns:aink="http://schemas.microsoft.com/office/drawing/2016/ink" xmlns:am3d="http://schemas.microsoft.com/office/drawing/2017/model3d" xmlns:o="urn:schemas-microsoft-com:office:office" xmlns:oel="http://schemas.microsoft.com/office/2019/extlst" xmlns:r="http://schemas.openxmlformats.org/officeDocument/2006/relationships" xmlns:m="http://schemas.openxmlformats.org/officeDocument/2006/math" xmlns:v="urn:schemas-microsoft-com:vml" xmlns:wp14="http://schemas.microsoft.com/office/word/2010/wordprocessingDrawing" xmlns:wp="http://schemas.openxmlformats.org/drawingml/2006/wordprocessingDrawing" xmlns:w10="urn:schemas-microsoft-com:office:word" xmlns:w="http://schemas.openxmlformats.org/wordprocessingml/2006/main" xmlns:w14="http://schemas.microsoft.com/office/word/2010/wordml" xmlns:w15="http://schemas.microsoft.com/office/word/2012/wordml" xmlns:w16cex="http://schemas.microsoft.com/office/word/2018/wordml/cex" xmlns:w16cid="http://schemas.microsoft.com/office/word/2016/wordml/cid" xmlns:w16="http://schemas.microsoft.com/office/word/2018/wordml" xmlns:w16du="http://schemas.microsoft.com/office/word/2023/wordml/word16du" xmlns:w16sdtdh="http://schemas.microsoft.com/office/word/2020/wordml/sdtdatahash" xmlns:w16sdtfl="http://schemas.microsoft.com/office/word/2024/wordml/sdtformatlock" xmlns:w16se="http://schemas.microsoft.com/office/word/2015/wordml/symex" xmlns:wpg="http://schemas.microsoft.com/office/word/2010/wordprocessingGroup" xmlns:wpi="http://schemas.microsoft.com/office/word/2010/wordprocessingInk" xmlns:wne="http://schemas.microsoft.com/office/word/2006/wordml" xmlns:wps="http://schemas.microsoft.com/office/word/2010/wordprocessingShape" mc:Ignorable="w14 w15 w16se w16cid w16 w16cex w16sdtdh w16sdtfl w16du wp14">
   <w:body>
     <w:p>
       <w:pPr>
@@ -8,13 +8,7 @@
         <w:jc w:val="center"/>
       </w:pPr>
       <w:r>
-        <w:t>Stage</w:t>
-      </w:r>
-      <w:r>
-        <w:t xml:space="preserve"> 1</w:t>
-      </w:r>
-      <w:r>
-        <w:t xml:space="preserve"> Tutorial Activity</w:t>
+        <w:t>Stage 1 Tutorial Activity</w:t>
       </w:r>
     </w:p>
     <w:p>
@@ -37,25 +31,7 @@
         <w:jc w:val="center"/>
       </w:pPr>
       <w:r>
-        <w:t>Stage</w:t>
-      </w:r>
-      <w:r>
-        <w:t xml:space="preserve"> 1 | Introduc</w:t>
-      </w:r>
-      <w:r>
-        <w:t>ing</w:t>
-      </w:r>
-      <w:r>
-        <w:t xml:space="preserve"> Software </w:t>
-      </w:r>
-      <w:r>
-        <w:t>Technology Case Study</w:t>
-      </w:r>
-      <w:r>
-        <w:t xml:space="preserve"> with Python and </w:t>
-      </w:r>
-      <w:r>
-        <w:t>Guided AI use</w:t>
+        <w:t>Stage 1 | Introducing Software Technology Case Study with Python and Guided AI use</w:t>
       </w:r>
     </w:p>
     <w:p>
@@ -121,17 +97,29 @@
     </w:p>
     <w:p>
       <w:r>
-        <w:t>1. ______________________________________________________________</w:t>
+        <w:t>1.</w:t>
+      </w:r>
+      <w:r>
+        <w:t xml:space="preserve"> The ability to read and interpret code, as the AI could make mistakes which need correcting.</w:t>
       </w:r>
     </w:p>
     <w:p>
       <w:r>
-        <w:t>2. ______________________________________________________________</w:t>
+        <w:t xml:space="preserve">2. </w:t>
+      </w:r>
+      <w:r>
+        <w:t>The ability to maintain and test the program, as the system could have faults that only show up further into the future.</w:t>
       </w:r>
     </w:p>
     <w:p>
       <w:r>
-        <w:t>3. ______________________________________________________________</w:t>
+        <w:t xml:space="preserve">3. </w:t>
+      </w:r>
+      <w:r>
+        <w:t>T</w:t>
+      </w:r>
+      <w:r>
+        <w:t>o know that AI is flawed in many ways, and to not blindly trust that the program generated is perfect.</w:t>
       </w:r>
     </w:p>
     <w:p>
@@ -152,6 +140,8 @@
       </w:r>
       <w:r>
         <w:br/>
+      </w:r>
+      <w:r>
         <w:t>Scenario C: An AI assistant generates a simple appointment application from one prompt.</w:t>
       </w:r>
     </w:p>
@@ -231,19 +221,40 @@
           <w:tcPr>
             <w:tcW w:w="2520" w:type="dxa"/>
           </w:tcPr>
-          <w:p/>
+          <w:p>
+            <w:r>
+              <w:t>Yes</w:t>
+            </w:r>
+          </w:p>
         </w:tc>
         <w:tc>
           <w:tcPr>
             <w:tcW w:w="2520" w:type="dxa"/>
           </w:tcPr>
-          <w:p/>
+          <w:p>
+            <w:r>
+              <w:t>Maybe</w:t>
+            </w:r>
+          </w:p>
         </w:tc>
         <w:tc>
           <w:tcPr>
             <w:tcW w:w="2520" w:type="dxa"/>
           </w:tcPr>
-          <w:p/>
+          <w:p>
+            <w:r>
+              <w:t>The student is writing code in Python to perform a given task (Of a calculator)</w:t>
+            </w:r>
+            <w:r>
+              <w:t>. This is programming because it’s writing a program</w:t>
+            </w:r>
+            <w:r>
+              <w:t>.</w:t>
+            </w:r>
+            <w:r>
+              <w:t xml:space="preserve"> This might be software engineering depending on the context, as if the student is continuing to develop, maintain, and test the calculator then it is software engineering, otherwise it is not.</w:t>
+            </w:r>
+          </w:p>
         </w:tc>
       </w:tr>
       <w:tr>
@@ -264,19 +275,41 @@
           <w:tcPr>
             <w:tcW w:w="2520" w:type="dxa"/>
           </w:tcPr>
-          <w:p/>
+          <w:p>
+            <w:r>
+              <w:t>Yes</w:t>
+            </w:r>
+          </w:p>
         </w:tc>
         <w:tc>
           <w:tcPr>
             <w:tcW w:w="2520" w:type="dxa"/>
           </w:tcPr>
-          <w:p/>
+          <w:p>
+            <w:r>
+              <w:t>Yes</w:t>
+            </w:r>
+          </w:p>
         </w:tc>
         <w:tc>
           <w:tcPr>
             <w:tcW w:w="2520" w:type="dxa"/>
           </w:tcPr>
-          <w:p/>
+          <w:p>
+            <w:r>
+              <w:t xml:space="preserve">This scenario is a team </w:t>
+            </w:r>
+            <w:r>
+              <w:t xml:space="preserve">of </w:t>
+            </w:r>
+            <w:r>
+              <w:lastRenderedPageBreak/>
+              <w:t xml:space="preserve">developers creating a payroll system to be used by 5,000 employees, which is why this is both programming and software engineering. This is programming because it uses </w:t>
+            </w:r>
+            <w:r>
+              <w:t>code to create a solution. And this is software engineering because a system of that size would require constant maintenance, testing, and continued development past the initial creation.</w:t>
+            </w:r>
+          </w:p>
         </w:tc>
       </w:tr>
       <w:tr>
@@ -289,6 +322,7 @@
           </w:tcPr>
           <w:p>
             <w:r>
+              <w:lastRenderedPageBreak/>
               <w:t>C</w:t>
             </w:r>
           </w:p>
@@ -297,19 +331,34 @@
           <w:tcPr>
             <w:tcW w:w="2520" w:type="dxa"/>
           </w:tcPr>
-          <w:p/>
+          <w:p>
+            <w:r>
+              <w:t>No</w:t>
+            </w:r>
+          </w:p>
         </w:tc>
         <w:tc>
           <w:tcPr>
             <w:tcW w:w="2520" w:type="dxa"/>
           </w:tcPr>
-          <w:p/>
+          <w:p>
+            <w:r>
+              <w:t>Maybe</w:t>
+            </w:r>
+          </w:p>
         </w:tc>
         <w:tc>
           <w:tcPr>
             <w:tcW w:w="2520" w:type="dxa"/>
           </w:tcPr>
-          <w:p/>
+          <w:p>
+            <w:r>
+              <w:t xml:space="preserve">In this situation the Artificial Intelligence is generating the program, hence the user is not programming. However, this could potentially be software engineering, depending on if the person using the AI reads through the generated program and adjusts it whenever needed. Furthermore, this would only be software engineering if this wasn’t a one-off situation, and the program generated would be continually monitored and </w:t>
+            </w:r>
+            <w:r>
+              <w:t>maintained.</w:t>
+            </w:r>
+          </w:p>
         </w:tc>
       </w:tr>
     </w:tbl>
@@ -438,6 +487,7 @@
     </w:p>
     <w:p>
       <w:r>
+        <w:lastRenderedPageBreak/>
         <w:t>2. ______________________________________________________________</w:t>
       </w:r>
     </w:p>
@@ -816,7 +866,7 @@
 </file>
 
 <file path=word/numbering.xml><?xml version="1.0" encoding="utf-8"?>
-<w:numbering xmlns:wpc="http://schemas.microsoft.com/office/word/2010/wordprocessingCanvas" xmlns:cx="http://schemas.microsoft.com/office/drawing/2014/chartex" xmlns:cx1="http://schemas.microsoft.com/office/drawing/2015/9/8/chartex" xmlns:cx2="http://schemas.microsoft.com/office/drawing/2015/10/21/chartex" xmlns:cx3="http://schemas.microsoft.com/office/drawing/2016/5/9/chartex" xmlns:cx4="http://schemas.microsoft.com/office/drawing/2016/5/10/chartex" xmlns:cx5="http://schemas.microsoft.com/office/drawing/2016/5/11/chartex" xmlns:cx6="http://schemas.microsoft.com/office/drawing/2016/5/12/chartex" xmlns:cx7="http://schemas.microsoft.com/office/drawing/2016/5/13/chartex" xmlns:cx8="http://schemas.microsoft.com/office/drawing/2016/5/14/chartex" xmlns:mc="http://schemas.openxmlformats.org/markup-compatibility/2006" xmlns:aink="http://schemas.microsoft.com/office/drawing/2016/ink" xmlns:am3d="http://schemas.microsoft.com/office/drawing/2017/model3d" xmlns:o="urn:schemas-microsoft-com:office:office" xmlns:oel="http://schemas.microsoft.com/office/2019/extlst" xmlns:r="http://schemas.openxmlformats.org/officeDocument/2006/relationships" xmlns:m="http://schemas.openxmlformats.org/officeDocument/2006/math" xmlns:v="urn:schemas-microsoft-com:vml" xmlns:wp14="http://schemas.microsoft.com/office/word/2010/wordprocessingDrawing" xmlns:wp="http://schemas.openxmlformats.org/drawingml/2006/wordprocessingDrawing" xmlns:w10="urn:schemas-microsoft-com:office:word" xmlns:w="http://schemas.openxmlformats.org/wordprocessingml/2006/main" xmlns:w14="http://schemas.microsoft.com/office/word/2010/wordml" xmlns:w15="http://schemas.microsoft.com/office/word/2012/wordml" xmlns:w16cei="http://schemas.microsoft.com/office/word/2026/wordml/cei" xmlns:w16cex="http://schemas.microsoft.com/office/word/2018/wordml/cex" xmlns:w16cid="http://schemas.microsoft.com/office/word/2016/wordml/cid" xmlns:w16="http://schemas.microsoft.com/office/word/2018/wordml" xmlns:w16du="http://schemas.microsoft.com/office/word/2023/wordml/word16du" xmlns:w16sdtdh="http://schemas.microsoft.com/office/word/2020/wordml/sdtdatahash" xmlns:w16sdtfl="http://schemas.microsoft.com/office/word/2024/wordml/sdtformatlock" xmlns:w16se="http://schemas.microsoft.com/office/word/2015/wordml/symex" xmlns:wpg="http://schemas.microsoft.com/office/word/2010/wordprocessingGroup" xmlns:wpi="http://schemas.microsoft.com/office/word/2010/wordprocessingInk" xmlns:wne="http://schemas.microsoft.com/office/word/2006/wordml" xmlns:wps="http://schemas.microsoft.com/office/word/2010/wordprocessingShape" mc:Ignorable="w14 w15 w16se w16cid w16 w16cex w16sdtdh w16sdtfl w16du wp14">
+<w:numbering xmlns:wpc="http://schemas.microsoft.com/office/word/2010/wordprocessingCanvas" xmlns:cx="http://schemas.microsoft.com/office/drawing/2014/chartex" xmlns:cx1="http://schemas.microsoft.com/office/drawing/2015/9/8/chartex" xmlns:cx2="http://schemas.microsoft.com/office/drawing/2015/10/21/chartex" xmlns:cx3="http://schemas.microsoft.com/office/drawing/2016/5/9/chartex" xmlns:cx4="http://schemas.microsoft.com/office/drawing/2016/5/10/chartex" xmlns:cx5="http://schemas.microsoft.com/office/drawing/2016/5/11/chartex" xmlns:cx6="http://schemas.microsoft.com/office/drawing/2016/5/12/chartex" xmlns:cx7="http://schemas.microsoft.com/office/drawing/2016/5/13/chartex" xmlns:cx8="http://schemas.microsoft.com/office/drawing/2016/5/14/chartex" xmlns:mc="http://schemas.openxmlformats.org/markup-compatibility/2006" xmlns:aink="http://schemas.microsoft.com/office/drawing/2016/ink" xmlns:am3d="http://schemas.microsoft.com/office/drawing/2017/model3d" xmlns:o="urn:schemas-microsoft-com:office:office" xmlns:oel="http://schemas.microsoft.com/office/2019/extlst" xmlns:r="http://schemas.openxmlformats.org/officeDocument/2006/relationships" xmlns:m="http://schemas.openxmlformats.org/officeDocument/2006/math" xmlns:v="urn:schemas-microsoft-com:vml" xmlns:wp14="http://schemas.microsoft.com/office/word/2010/wordprocessingDrawing" xmlns:wp="http://schemas.openxmlformats.org/drawingml/2006/wordprocessingDrawing" xmlns:w10="urn:schemas-microsoft-com:office:word" xmlns:w="http://schemas.openxmlformats.org/wordprocessingml/2006/main" xmlns:w14="http://schemas.microsoft.com/office/word/2010/wordml" xmlns:w15="http://schemas.microsoft.com/office/word/2012/wordml" xmlns:w16cex="http://schemas.microsoft.com/office/word/2018/wordml/cex" xmlns:w16cid="http://schemas.microsoft.com/office/word/2016/wordml/cid" xmlns:w16="http://schemas.microsoft.com/office/word/2018/wordml" xmlns:w16du="http://schemas.microsoft.com/office/word/2023/wordml/word16du" xmlns:w16sdtdh="http://schemas.microsoft.com/office/word/2020/wordml/sdtdatahash" xmlns:w16sdtfl="http://schemas.microsoft.com/office/word/2024/wordml/sdtformatlock" xmlns:w16se="http://schemas.microsoft.com/office/word/2015/wordml/symex" xmlns:wpg="http://schemas.microsoft.com/office/word/2010/wordprocessingGroup" xmlns:wpi="http://schemas.microsoft.com/office/word/2010/wordprocessingInk" xmlns:wne="http://schemas.microsoft.com/office/word/2006/wordml" xmlns:wps="http://schemas.microsoft.com/office/word/2010/wordprocessingShape" mc:Ignorable="w14 w15 w16se w16cid w16 w16cex w16sdtdh w16sdtfl w16du wp14">
   <w:abstractNum w:abstractNumId="0" w15:restartNumberingAfterBreak="0">
     <w:nsid w:val="FFFFFF7C"/>
     <w:multiLevelType w:val="singleLevel"/>
@@ -10543,7 +10593,7 @@
       </w:tcPr>
     </w:tblStylePr>
   </w:style>
-  <w:style w:type="table" w:styleId="ColorfulShading">
+  <w:style w:type="table" w:styleId="ColourfulShading">
     <w:name w:val="Colorful Shading"/>
     <w:basedOn w:val="TableNormal"/>
     <w:uiPriority w:val="71"/>
@@ -10658,7 +10708,7 @@
       </w:rPr>
     </w:tblStylePr>
   </w:style>
-  <w:style w:type="table" w:styleId="ColorfulShading-Accent1">
+  <w:style w:type="table" w:styleId="ColourfulShadingAccent1">
     <w:name w:val="Colorful Shading Accent 1"/>
     <w:basedOn w:val="TableNormal"/>
     <w:uiPriority w:val="71"/>
@@ -10773,7 +10823,7 @@
       </w:rPr>
     </w:tblStylePr>
   </w:style>
-  <w:style w:type="table" w:styleId="ColorfulShading-Accent2">
+  <w:style w:type="table" w:styleId="ColourfulShadingAccent2">
     <w:name w:val="Colorful Shading Accent 2"/>
     <w:basedOn w:val="TableNormal"/>
     <w:uiPriority w:val="71"/>
@@ -10888,7 +10938,7 @@
       </w:rPr>
     </w:tblStylePr>
   </w:style>
-  <w:style w:type="table" w:styleId="ColorfulShading-Accent3">
+  <w:style w:type="table" w:styleId="ColourfulShadingAccent3">
     <w:name w:val="Colorful Shading Accent 3"/>
     <w:basedOn w:val="TableNormal"/>
     <w:uiPriority w:val="71"/>
@@ -10993,7 +11043,7 @@
       </w:tcPr>
     </w:tblStylePr>
   </w:style>
-  <w:style w:type="table" w:styleId="ColorfulShading-Accent4">
+  <w:style w:type="table" w:styleId="ColourfulShadingAccent4">
     <w:name w:val="Colorful Shading Accent 4"/>
     <w:basedOn w:val="TableNormal"/>
     <w:uiPriority w:val="71"/>
@@ -11108,7 +11158,7 @@
       </w:rPr>
     </w:tblStylePr>
   </w:style>
-  <w:style w:type="table" w:styleId="ColorfulShading-Accent5">
+  <w:style w:type="table" w:styleId="ColourfulShadingAccent5">
     <w:name w:val="Colorful Shading Accent 5"/>
     <w:basedOn w:val="TableNormal"/>
     <w:uiPriority w:val="71"/>
@@ -11223,7 +11273,7 @@
       </w:rPr>
     </w:tblStylePr>
   </w:style>
-  <w:style w:type="table" w:styleId="ColorfulShading-Accent6">
+  <w:style w:type="table" w:styleId="ColourfulShadingAccent6">
     <w:name w:val="Colorful Shading Accent 6"/>
     <w:basedOn w:val="TableNormal"/>
     <w:uiPriority w:val="71"/>
@@ -11338,7 +11388,7 @@
       </w:rPr>
     </w:tblStylePr>
   </w:style>
-  <w:style w:type="table" w:styleId="ColorfulList">
+  <w:style w:type="table" w:styleId="ColourfulList">
     <w:name w:val="Colorful List"/>
     <w:basedOn w:val="TableNormal"/>
     <w:uiPriority w:val="72"/>
@@ -11417,7 +11467,7 @@
       </w:tcPr>
     </w:tblStylePr>
   </w:style>
-  <w:style w:type="table" w:styleId="ColorfulList-Accent1">
+  <w:style w:type="table" w:styleId="ColourfulListAccent1">
     <w:name w:val="Colorful List Accent 1"/>
     <w:basedOn w:val="TableNormal"/>
     <w:uiPriority w:val="72"/>
@@ -11496,7 +11546,7 @@
       </w:tcPr>
     </w:tblStylePr>
   </w:style>
-  <w:style w:type="table" w:styleId="ColorfulList-Accent2">
+  <w:style w:type="table" w:styleId="ColourfulListAccent2">
     <w:name w:val="Colorful List Accent 2"/>
     <w:basedOn w:val="TableNormal"/>
     <w:uiPriority w:val="72"/>
@@ -11575,7 +11625,7 @@
       </w:tcPr>
     </w:tblStylePr>
   </w:style>
-  <w:style w:type="table" w:styleId="ColorfulList-Accent3">
+  <w:style w:type="table" w:styleId="ColourfulListAccent3">
     <w:name w:val="Colorful List Accent 3"/>
     <w:basedOn w:val="TableNormal"/>
     <w:uiPriority w:val="72"/>
@@ -11654,7 +11704,7 @@
       </w:tcPr>
     </w:tblStylePr>
   </w:style>
-  <w:style w:type="table" w:styleId="ColorfulList-Accent4">
+  <w:style w:type="table" w:styleId="ColourfulListAccent4">
     <w:name w:val="Colorful List Accent 4"/>
     <w:basedOn w:val="TableNormal"/>
     <w:uiPriority w:val="72"/>
@@ -11733,7 +11783,7 @@
       </w:tcPr>
     </w:tblStylePr>
   </w:style>
-  <w:style w:type="table" w:styleId="ColorfulList-Accent5">
+  <w:style w:type="table" w:styleId="ColourfulListAccent5">
     <w:name w:val="Colorful List Accent 5"/>
     <w:basedOn w:val="TableNormal"/>
     <w:uiPriority w:val="72"/>
@@ -11812,7 +11862,7 @@
       </w:tcPr>
     </w:tblStylePr>
   </w:style>
-  <w:style w:type="table" w:styleId="ColorfulList-Accent6">
+  <w:style w:type="table" w:styleId="ColourfulListAccent6">
     <w:name w:val="Colorful List Accent 6"/>
     <w:basedOn w:val="TableNormal"/>
     <w:uiPriority w:val="72"/>
@@ -11891,7 +11941,7 @@
       </w:tcPr>
     </w:tblStylePr>
   </w:style>
-  <w:style w:type="table" w:styleId="ColorfulGrid">
+  <w:style w:type="table" w:styleId="ColourfulGrid">
     <w:name w:val="Colorful Grid"/>
     <w:basedOn w:val="TableNormal"/>
     <w:uiPriority w:val="73"/>
@@ -11964,7 +12014,7 @@
       </w:tcPr>
     </w:tblStylePr>
   </w:style>
-  <w:style w:type="table" w:styleId="ColorfulGrid-Accent1">
+  <w:style w:type="table" w:styleId="ColourfulGridAccent1">
     <w:name w:val="Colorful Grid Accent 1"/>
     <w:basedOn w:val="TableNormal"/>
     <w:uiPriority w:val="73"/>
@@ -12037,7 +12087,7 @@
       </w:tcPr>
     </w:tblStylePr>
   </w:style>
-  <w:style w:type="table" w:styleId="ColorfulGrid-Accent2">
+  <w:style w:type="table" w:styleId="ColourfulGridAccent2">
     <w:name w:val="Colorful Grid Accent 2"/>
     <w:basedOn w:val="TableNormal"/>
     <w:uiPriority w:val="73"/>
@@ -12110,7 +12160,7 @@
       </w:tcPr>
     </w:tblStylePr>
   </w:style>
-  <w:style w:type="table" w:styleId="ColorfulGrid-Accent3">
+  <w:style w:type="table" w:styleId="ColourfulGridAccent3">
     <w:name w:val="Colorful Grid Accent 3"/>
     <w:basedOn w:val="TableNormal"/>
     <w:uiPriority w:val="73"/>
@@ -12183,7 +12233,7 @@
       </w:tcPr>
     </w:tblStylePr>
   </w:style>
-  <w:style w:type="table" w:styleId="ColorfulGrid-Accent4">
+  <w:style w:type="table" w:styleId="ColourfulGridAccent4">
     <w:name w:val="Colorful Grid Accent 4"/>
     <w:basedOn w:val="TableNormal"/>
     <w:uiPriority w:val="73"/>
@@ -12256,7 +12306,7 @@
       </w:tcPr>
     </w:tblStylePr>
   </w:style>
-  <w:style w:type="table" w:styleId="ColorfulGrid-Accent5">
+  <w:style w:type="table" w:styleId="ColourfulGridAccent5">
     <w:name w:val="Colorful Grid Accent 5"/>
     <w:basedOn w:val="TableNormal"/>
     <w:uiPriority w:val="73"/>
@@ -12329,7 +12379,7 @@
       </w:tcPr>
     </w:tblStylePr>
   </w:style>
-  <w:style w:type="table" w:styleId="ColorfulGrid-Accent6">
+  <w:style w:type="table" w:styleId="ColourfulGridAccent6">
     <w:name w:val="Colorful Grid Accent 6"/>
     <w:basedOn w:val="TableNormal"/>
     <w:uiPriority w:val="73"/>

</xml_diff>